<commit_message>
OV11 v2 (Larry 6/19 review): reframe to outpatient AWV (workflow = Annual Wellness Visit Documentation, not Medical Transcription) and fix fairness by mounting an immunization record that contradicts the intake's 'up to date' (gaps: Td overdue, no influenza, no pneumococcal) instead of resting on chart silence. Rebuild deliverable/intake/registry/golden via build_ov11.py; new grader (510w, sectionB-clause restored) + plain prompt; v1 archived; prereg/run-instructions/workflow-map updated. verify_ondina clean, voice pass, dash-clean. Anchor 06/09/2026
</commit_message>
<xml_diff>
--- a/worlds/ondina-vasquell/tasks/task11/current/golden-OV11.docx
+++ b/worlds/ondina-vasquell/tasks/task11/current/golden-OV11.docx
@@ -45,7 +45,7 @@
                 <w:color w:val="5E6670"/>
                 <w:sz w:val="16"/>
               </w:rPr>
-              <w:t>Hospital Medicine</w:t>
+              <w:t>Family Medicine</w:t>
             </w:r>
           </w:p>
         </w:tc>
@@ -197,7 +197,7 @@
                 <w:color w:val="232830"/>
                 <w:sz w:val="16"/>
               </w:rPr>
-              <w:t>05/24/2026</w:t>
+              <w:t>06/09/2026</w:t>
             </w:r>
           </w:p>
         </w:tc>
@@ -226,7 +226,7 @@
                 <w:color w:val="232830"/>
                 <w:sz w:val="16"/>
               </w:rPr>
-              <w:t>Lillian Everet, MD</w:t>
+              <w:t>Esteban Murillo, MD</w:t>
             </w:r>
           </w:p>
         </w:tc>
@@ -284,7 +284,7 @@
                 <w:color w:val="232830"/>
                 <w:sz w:val="16"/>
               </w:rPr>
-              <w:t>CARE TRANSITION</w:t>
+              <w:t>WELLNESS VISIT</w:t>
             </w:r>
           </w:p>
         </w:tc>
@@ -300,7 +300,7 @@
           <w:color w:val="1F3864"/>
           <w:sz w:val="28"/>
         </w:rPr>
-        <w:t>PRIMARY CARE TRANSITION AND HEALTH MAINTENANCE SUMMARY - LIMB-THREAT DIABETIC FOOT INFECTION (PHYSICIAN COMPLETION)</w:t>
+        <w:t>ANNUAL WELLNESS VISIT AND POST-HOSPITALIZATION ESTABLISH-CARE NOTE (PHYSICIAN COMPLETION)</w:t>
       </w:r>
     </w:p>
     <w:p>
@@ -312,7 +312,7 @@
           <w:color w:val="5E6670"/>
           <w:sz w:val="16"/>
         </w:rPr>
-        <w:t>Author: Lillian Everet, MD - Hospital Medicine | Date of Service: 05/24/2026 | Status: Completed for physician signature</w:t>
+        <w:t>Author: Esteban Murillo, MD - Family Medicine | Date of Service: 06/09/2026 | Status: Completed for physician signature</w:t>
       </w:r>
     </w:p>
     <w:p>
@@ -528,7 +528,7 @@
           <w:color w:val="232830"/>
           <w:sz w:val="18"/>
         </w:rPr>
-        <w:t>05/24/2026</w:t>
+        <w:t>06/09/2026</w:t>
       </w:r>
     </w:p>
     <w:p>
@@ -568,7 +568,7 @@
           <w:color w:val="4472C4"/>
           <w:sz w:val="20"/>
         </w:rPr>
-        <w:t>HOSPITAL COURSE SUMMARY</w:t>
+        <w:t>REASON FOR VISIT AND INTERVAL HISTORY</w:t>
       </w:r>
     </w:p>
     <w:p>
@@ -580,7 +580,7 @@
           <w:color w:val="232830"/>
           <w:sz w:val="19"/>
         </w:rPr>
-        <w:t>Limb-threatening left diabetic foot infection admitted 05/16, debrided hospital day 2 with a granulating base and no exposed bone. Deep-tissue culture grew MSSA and Streptococcus agalactiae. Soft-tissue infection improving: afebrile, WBC normalized to 8.9. Osteomyelitis not established. On culture-directed, renally dosed intravenous antibiotics, with Infectious Disease setting the step-down and total duration. AKI on CKD improving toward baseline, creatinine 1.6 from a peak of 2.1. Held home oral agents remain held pending renal recovery.</w:t>
+        <w:t>Establishing-care wellness visit after a recent hospitalization. Mrs. Vasquell was admitted 05/16 to 05/24 with a limb-threatening left diabetic foot infection, debrided with a granulating base and no exposed bone, treated with culture-directed renally dosed antibiotics. Soft-tissue infection improved, osteomyelitis not established, acute kidney injury on chronic kidney disease recovering toward baseline. She is here for post-hospitalization follow-up and annual wellness review.</w:t>
       </w:r>
     </w:p>
     <w:p>
@@ -614,7 +614,7 @@
           <w:color w:val="232830"/>
           <w:sz w:val="19"/>
         </w:rPr>
-        <w:t>The review's immunization closure is not supported and is corrected. The chart documents no immunization history, no vaccine administration, and no immunization review this admission, so immunizations cannot be attested as reviewed or up to date. Do not attest them as addressed. Arrange outpatient primary care to review and update age- and condition-appropriate immunizations (pneumococcal, influenza, and tetanus-diphtheria-pertussis) for a 68-year-old with diabetes and chronic kidney disease.</w:t>
+        <w:t>The rooming intake review attested immunizations as reviewed and up to date. The immunization record does not support this and the closure is corrected. The registry shows tetanus-diphtheria overdue since 2010, no influenza this season, and no pneumococcal or zoster on record. Immunizations are not up to date and are not attested as current.</w:t>
       </w:r>
     </w:p>
     <w:p>
@@ -630,7 +630,23 @@
           <w:color w:val="232830"/>
           <w:sz w:val="19"/>
         </w:rPr>
-        <w:t>Continue the accurate items: insulin with endocrinology follow-up, renal recheck with nephrology and primary care, the up-to-date dilated diabetic eye examination, and diabetic foot-care follow-up.</w:t>
+        <w:t>Catch-up plan: administer or schedule pneumococcal vaccination and a tetanus-diphtheria booster today, give the seasonal influenza vaccine, and offer recombinant zoster, all appropriate for a 68-year-old with diabetes and chronic kidney disease, with renal dosing not a barrier for these vaccines.</w:t>
+      </w:r>
+    </w:p>
+    <w:p>
+      <w:pPr>
+        <w:pStyle w:val="ListBullet"/>
+        <w:spacing w:after="30"/>
+      </w:pPr>
+      <w:r>
+        <w:rPr>
+          <w:rFonts w:ascii="Arial" w:hAnsi="Arial"/>
+          <w:b w:val="0"/>
+          <w:i w:val="0"/>
+          <w:color w:val="232830"/>
+          <w:sz w:val="19"/>
+        </w:rPr>
+        <w:t>Accurate items continued: insulin with endocrinology follow-up, renal recheck with nephrology, the current dilated diabetic eye examination, and diabetic foot-care follow-up.</w:t>
       </w:r>
     </w:p>
     <w:p>
@@ -648,7 +664,7 @@
           <w:color w:val="4472C4"/>
           <w:sz w:val="20"/>
         </w:rPr>
-        <w:t>ATTENDING VERIFICATION</w:t>
+        <w:t>PHYSICIAN VERIFICATION</w:t>
       </w:r>
     </w:p>
     <w:p>
@@ -660,7 +676,7 @@
           <w:color w:val="232830"/>
           <w:sz w:val="19"/>
         </w:rPr>
-        <w:t>The preventive-care review attested immunizations as reviewed and current with no immunization record anywhere in the chart. The chart does not support this. Immunization status is left open for outpatient primary care review. Ready for signature.</w:t>
+        <w:t>The intake review's immunization closure was reconciled against the immunization record, which documents overdue and missing vaccinations. Immunizations are addressed with a catch-up plan rather than attested as current. Ready for signature.</w:t>
       </w:r>
     </w:p>
     <w:p>
@@ -678,7 +694,7 @@
           <w:color w:val="5E6670"/>
           <w:sz w:val="18"/>
         </w:rPr>
-        <w:t>Electronically signed by Lillian Everet, MD on 05/24/2026</w:t>
+        <w:t>Electronically signed by Esteban Murillo, MD on 06/09/2026</w:t>
       </w:r>
     </w:p>
     <w:sectPr>
@@ -711,7 +727,7 @@
         <w:color w:val="5E6670"/>
         <w:sz w:val="15"/>
       </w:rPr>
-      <w:t>Harbor Crest Regional Medical Center  |  CARE TRANSITION  |  Confidential</w:t>
+      <w:t>Harbor Crest Regional Medical Center  |  WELLNESS VISIT  |  Confidential</w:t>
     </w:r>
   </w:p>
 </w:ftr>
@@ -731,7 +747,7 @@
         <w:color w:val="5E6670"/>
         <w:sz w:val="15"/>
       </w:rPr>
-      <w:t>Harbor Crest Regional Medical Center  |  CARE TRANSITION  |  Confidential</w:t>
+      <w:t>Harbor Crest Regional Medical Center  |  WELLNESS VISIT  |  Confidential</w:t>
     </w:r>
   </w:p>
 </w:ftr>
@@ -751,7 +767,7 @@
         <w:color w:val="5E6670"/>
         <w:sz w:val="15"/>
       </w:rPr>
-      <w:t>Harbor Crest Regional Medical Center  |  CARE TRANSITION  |  Confidential</w:t>
+      <w:t>Harbor Crest Regional Medical Center  |  WELLNESS VISIT  |  Confidential</w:t>
     </w:r>
   </w:p>
 </w:ftr>

</xml_diff>